<commit_message>
IPC: fix non-clickable NABH/NCDC/ICMR citation URLs
Converted the NABH, NCDC, and ICMR AMSP Guideline citation links across
all 8 IPC files (several files cite these more than once, in multiple
sub-sections) from plain text containing a URL into real clickable
OOXML hyperlinks.

Co-Authored-By: Claude Sonnet 5 <noreply@anthropic.com>
Claude-Session: https://claude.ai/code/session_016VFLsECWt4VArpBiaqgrgF
</commit_message>
<xml_diff>
--- a/policies/build/chapters_v2/IPC/Documents/IPC_Package_v2/IPC1/SOP_IPC1_infection_prevention_and_control_programme.docx
+++ b/policies/build/chapters_v2/IPC/Documents/IPC_Package_v2/IPC1/SOP_IPC1_infection_prevention_and_control_programme.docx
@@ -568,13 +568,16 @@
       <w:pPr>
         <w:pStyle w:val="ListParagraph"/>
       </w:pPr>
-      <w:r>
-        <w:rPr>
-          <w:i/>
-          <w:sz w:val="18"/>
-        </w:rPr>
-        <w:t>National Accreditation Board for Hospitals and Healthcare Providers. (2025). NABH accreditation standards for hospitals (6th ed.), IPC.1. ISBN 978-81-965264-9-8. https://portal.nabh.co/images/Standards/NABH%20Hospital%20Accreditation%20Standard%206th%20Edition%20January%202025.pdf</w:t>
-      </w:r>
+      <w:hyperlink r:id="rId12">
+        <w:r>
+          <w:rPr>
+            <w:rStyle w:val="Hyperlink"/>
+            <w:i/>
+            <w:sz w:val="18"/>
+          </w:rPr>
+          <w:t>National Accreditation Board for Hospitals and Healthcare Providers. (2025). NABH accreditation standards for hospitals (6th ed.), IPC.1. ISBN 978-81-965264-9-8. https://portal.nabh.co/images/Standards/NABH%20Hospital%20Accreditation%20Standard%206th%20Edition%20January%202025.pdf</w:t>
+        </w:r>
+      </w:hyperlink>
     </w:p>
     <w:p>
       <w:pPr>
@@ -695,13 +698,16 @@
       <w:pPr>
         <w:pStyle w:val="ListParagraph"/>
       </w:pPr>
-      <w:r>
-        <w:rPr>
-          <w:i/>
-          <w:sz w:val="18"/>
-        </w:rPr>
-        <w:t>National Accreditation Board for Hospitals and Healthcare Providers. (2025). NABH accreditation standards for hospitals (6th ed.), IPC.1. ISBN 978-81-965264-9-8. https://portal.nabh.co/images/Standards/NABH%20Hospital%20Accreditation%20Standard%206th%20Edition%20January%202025.pdf</w:t>
-      </w:r>
+      <w:hyperlink r:id="rId12">
+        <w:r>
+          <w:rPr>
+            <w:rStyle w:val="Hyperlink"/>
+            <w:i/>
+            <w:sz w:val="18"/>
+          </w:rPr>
+          <w:t>National Accreditation Board for Hospitals and Healthcare Providers. (2025). NABH accreditation standards for hospitals (6th ed.), IPC.1. ISBN 978-81-965264-9-8. https://portal.nabh.co/images/Standards/NABH%20Hospital%20Accreditation%20Standard%206th%20Edition%20January%202025.pdf</w:t>
+        </w:r>
+      </w:hyperlink>
     </w:p>
     <w:p>
       <w:pPr>
@@ -841,13 +847,16 @@
       <w:pPr>
         <w:pStyle w:val="ListParagraph"/>
       </w:pPr>
-      <w:r>
-        <w:rPr>
-          <w:i/>
-          <w:sz w:val="18"/>
-        </w:rPr>
-        <w:t>National Accreditation Board for Hospitals and Healthcare Providers. (2025). NABH accreditation standards for hospitals (6th ed.), IPC.1. ISBN 978-81-965264-9-8. https://portal.nabh.co/images/Standards/NABH%20Hospital%20Accreditation%20Standard%206th%20Edition%20January%202025.pdf</w:t>
-      </w:r>
+      <w:hyperlink r:id="rId12">
+        <w:r>
+          <w:rPr>
+            <w:rStyle w:val="Hyperlink"/>
+            <w:i/>
+            <w:sz w:val="18"/>
+          </w:rPr>
+          <w:t>National Accreditation Board for Hospitals and Healthcare Providers. (2025). NABH accreditation standards for hospitals (6th ed.), IPC.1. ISBN 978-81-965264-9-8. https://portal.nabh.co/images/Standards/NABH%20Hospital%20Accreditation%20Standard%206th%20Edition%20January%202025.pdf</w:t>
+        </w:r>
+      </w:hyperlink>
     </w:p>
     <w:p>
       <w:pPr>
@@ -906,13 +915,16 @@
       <w:pPr>
         <w:pStyle w:val="ListParagraph"/>
       </w:pPr>
-      <w:r>
-        <w:rPr>
-          <w:i/>
-          <w:sz w:val="18"/>
-        </w:rPr>
-        <w:t>National Accreditation Board for Hospitals and Healthcare Providers. (2025). NABH accreditation standards for hospitals (6th ed.), IPC.1. ISBN 978-81-965264-9-8. https://portal.nabh.co/images/Standards/NABH%20Hospital%20Accreditation%20Standard%206th%20Edition%20January%202025.pdf</w:t>
-      </w:r>
+      <w:hyperlink r:id="rId12">
+        <w:r>
+          <w:rPr>
+            <w:rStyle w:val="Hyperlink"/>
+            <w:i/>
+            <w:sz w:val="18"/>
+          </w:rPr>
+          <w:t>National Accreditation Board for Hospitals and Healthcare Providers. (2025). NABH accreditation standards for hospitals (6th ed.), IPC.1. ISBN 978-81-965264-9-8. https://portal.nabh.co/images/Standards/NABH%20Hospital%20Accreditation%20Standard%206th%20Edition%20January%202025.pdf</w:t>
+        </w:r>
+      </w:hyperlink>
     </w:p>
     <w:p>
       <w:pPr>
@@ -971,13 +983,16 @@
       <w:pPr>
         <w:pStyle w:val="ListParagraph"/>
       </w:pPr>
-      <w:r>
-        <w:rPr>
-          <w:i/>
-          <w:sz w:val="18"/>
-        </w:rPr>
-        <w:t>National Accreditation Board for Hospitals and Healthcare Providers. (2025). NABH accreditation standards for hospitals (6th ed.), IPC.1. ISBN 978-81-965264-9-8. https://portal.nabh.co/images/Standards/NABH%20Hospital%20Accreditation%20Standard%206th%20Edition%20January%202025.pdf</w:t>
-      </w:r>
+      <w:hyperlink r:id="rId12">
+        <w:r>
+          <w:rPr>
+            <w:rStyle w:val="Hyperlink"/>
+            <w:i/>
+            <w:sz w:val="18"/>
+          </w:rPr>
+          <w:t>National Accreditation Board for Hospitals and Healthcare Providers. (2025). NABH accreditation standards for hospitals (6th ed.), IPC.1. ISBN 978-81-965264-9-8. https://portal.nabh.co/images/Standards/NABH%20Hospital%20Accreditation%20Standard%206th%20Edition%20January%202025.pdf</w:t>
+        </w:r>
+      </w:hyperlink>
     </w:p>
     <w:p>
       <w:pPr>
@@ -1036,13 +1051,16 @@
       <w:pPr>
         <w:pStyle w:val="ListParagraph"/>
       </w:pPr>
-      <w:r>
-        <w:rPr>
-          <w:i/>
-          <w:sz w:val="18"/>
-        </w:rPr>
-        <w:t>National Accreditation Board for Hospitals and Healthcare Providers. (2025). NABH accreditation standards for hospitals (6th ed.), IPC.1. ISBN 978-81-965264-9-8. https://portal.nabh.co/images/Standards/NABH%20Hospital%20Accreditation%20Standard%206th%20Edition%20January%202025.pdf</w:t>
-      </w:r>
+      <w:hyperlink r:id="rId12">
+        <w:r>
+          <w:rPr>
+            <w:rStyle w:val="Hyperlink"/>
+            <w:i/>
+            <w:sz w:val="18"/>
+          </w:rPr>
+          <w:t>National Accreditation Board for Hospitals and Healthcare Providers. (2025). NABH accreditation standards for hospitals (6th ed.), IPC.1. ISBN 978-81-965264-9-8. https://portal.nabh.co/images/Standards/NABH%20Hospital%20Accreditation%20Standard%206th%20Edition%20January%202025.pdf</w:t>
+        </w:r>
+      </w:hyperlink>
     </w:p>
     <w:p>
       <w:pPr>
@@ -1227,23 +1245,29 @@
       <w:pPr>
         <w:pStyle w:val="ListParagraph"/>
       </w:pPr>
-      <w:r>
-        <w:rPr>
-          <w:i/>
-        </w:rPr>
-        <w:t>National Accreditation Board for Hospitals and Healthcare Providers. (2025). NABH accreditation standards for hospitals (6th ed.), IPC.1. ISBN 978-81-965264-9-8. https://portal.nabh.co/images/Standards/NABH%20Hospital%20Accreditation%20Standard%206th%20Edition%20January%202025.pdf</w:t>
-      </w:r>
+      <w:hyperlink r:id="rId12">
+        <w:r>
+          <w:rPr>
+            <w:rStyle w:val="Hyperlink"/>
+            <w:i/>
+          </w:rPr>
+          <w:t>National Accreditation Board for Hospitals and Healthcare Providers. (2025). NABH accreditation standards for hospitals (6th ed.), IPC.1. ISBN 978-81-965264-9-8. https://portal.nabh.co/images/Standards/NABH%20Hospital%20Accreditation%20Standard%206th%20Edition%20January%202025.pdf</w:t>
+        </w:r>
+      </w:hyperlink>
     </w:p>
     <w:p>
       <w:pPr>
         <w:pStyle w:val="ListParagraph"/>
       </w:pPr>
-      <w:r>
-        <w:rPr>
-          <w:i/>
-        </w:rPr>
-        <w:t>National Centre for Disease Control &amp; Ministry of Health and Family Welfare, Government of India. (2020). National guidelines for infection prevention and control in healthcare facilities. https://ncdc.mohfw.gov.in/wp-content/uploads/2024/03/83538105781625557301.pdf</w:t>
-      </w:r>
+      <w:hyperlink r:id="rId13">
+        <w:r>
+          <w:rPr>
+            <w:rStyle w:val="Hyperlink"/>
+            <w:i/>
+          </w:rPr>
+          <w:t>National Centre for Disease Control &amp; Ministry of Health and Family Welfare, Government of India. (2020). National guidelines for infection prevention and control in healthcare facilities. https://ncdc.mohfw.gov.in/wp-content/uploads/2024/03/83538105781625557301.pdf</w:t>
+        </w:r>
+      </w:hyperlink>
     </w:p>
     <w:p>
       <w:pPr>

</xml_diff>